<commit_message>
Presentation: drop team slide, shorten scripts to equal length
Removes the 'who is presenting what' slide and Malhar's line for it, and
rewrites every presenter's script to 115 words (about 50 seconds), split
evenly across their two slides. Slides renumbered to 16.

Co-Authored-By: Claude Sonnet 5.5 <noreply@anthropic.com>
Claude-Session: https://claude.ai/code/session_01E3Fcwf7VFF2nYXAmgumQT3
</commit_message>
<xml_diff>
--- a/presentation/Presentation_Scripts.docx
+++ b/presentation/Presentation_Scripts.docx
@@ -183,7 +183,7 @@
               <w:rPr>
                 <w:sz w:val="22"/>
               </w:rPr>
-              <w:t>3–4 (+1, 2)</w:t>
+              <w:t>2–3 (+1)</w:t>
             </w:r>
           </w:p>
         </w:tc>
@@ -196,7 +196,7 @@
               <w:rPr>
                 <w:sz w:val="22"/>
               </w:rPr>
-              <w:t>2:50 min</w:t>
+              <w:t>115 words, about 50 sec</w:t>
             </w:r>
           </w:p>
         </w:tc>
@@ -254,7 +254,7 @@
               <w:rPr>
                 <w:sz w:val="22"/>
               </w:rPr>
-              <w:t>5–6</w:t>
+              <w:t>4–5</w:t>
             </w:r>
           </w:p>
         </w:tc>
@@ -268,7 +268,7 @@
               <w:rPr>
                 <w:sz w:val="22"/>
               </w:rPr>
-              <w:t>2:00 min</w:t>
+              <w:t>115 words, about 50 sec</w:t>
             </w:r>
           </w:p>
         </w:tc>
@@ -322,7 +322,7 @@
               <w:rPr>
                 <w:sz w:val="22"/>
               </w:rPr>
-              <w:t>7–8</w:t>
+              <w:t>6–7</w:t>
             </w:r>
           </w:p>
         </w:tc>
@@ -335,7 +335,7 @@
               <w:rPr>
                 <w:sz w:val="22"/>
               </w:rPr>
-              <w:t>2:00 min</w:t>
+              <w:t>115 words, about 50 sec</w:t>
             </w:r>
           </w:p>
         </w:tc>
@@ -393,7 +393,7 @@
               <w:rPr>
                 <w:sz w:val="22"/>
               </w:rPr>
-              <w:t>9–10</w:t>
+              <w:t>8–9</w:t>
             </w:r>
           </w:p>
         </w:tc>
@@ -407,7 +407,7 @@
               <w:rPr>
                 <w:sz w:val="22"/>
               </w:rPr>
-              <w:t>1:50 min</w:t>
+              <w:t>115 words, about 50 sec</w:t>
             </w:r>
           </w:p>
         </w:tc>
@@ -461,7 +461,7 @@
               <w:rPr>
                 <w:sz w:val="22"/>
               </w:rPr>
-              <w:t>11–12</w:t>
+              <w:t>10–11</w:t>
             </w:r>
           </w:p>
         </w:tc>
@@ -474,7 +474,7 @@
               <w:rPr>
                 <w:sz w:val="22"/>
               </w:rPr>
-              <w:t>2:00 min</w:t>
+              <w:t>115 words, about 50 sec</w:t>
             </w:r>
           </w:p>
         </w:tc>
@@ -532,7 +532,7 @@
               <w:rPr>
                 <w:sz w:val="22"/>
               </w:rPr>
-              <w:t>13–14</w:t>
+              <w:t>12–13</w:t>
             </w:r>
           </w:p>
         </w:tc>
@@ -546,7 +546,7 @@
               <w:rPr>
                 <w:sz w:val="22"/>
               </w:rPr>
-              <w:t>2:00 min</w:t>
+              <w:t>115 words, about 50 sec</w:t>
             </w:r>
           </w:p>
         </w:tc>
@@ -600,7 +600,7 @@
               <w:rPr>
                 <w:sz w:val="22"/>
               </w:rPr>
-              <w:t>15–16</w:t>
+              <w:t>14–15</w:t>
             </w:r>
           </w:p>
         </w:tc>
@@ -613,7 +613,7 @@
               <w:rPr>
                 <w:sz w:val="22"/>
               </w:rPr>
-              <w:t>1:50 min</w:t>
+              <w:t>115 words, about 50 sec</w:t>
             </w:r>
           </w:p>
         </w:tc>
@@ -639,7 +639,7 @@
         <w:pStyle w:val="ListBullet"/>
       </w:pPr>
       <w:r>
-        <w:t>Each script is written to be spoken, not read: short sentences, one idea at a time. Put it in your own words once you know it.</w:t>
+        <w:t>Each script is written to be spoken, not read, and every presenter has the same length: about 115 words, roughly 50 seconds. Put it in your own words once you know it.</w:t>
       </w:r>
     </w:p>
     <w:p>
@@ -647,7 +647,7 @@
         <w:pStyle w:val="ListBullet"/>
       </w:pPr>
       <w:r>
-        <w:t>Timing assumes about 140 words per minute, so each person speaks for roughly two minutes. The same text is in the speaker notes of the matching slides.</w:t>
+        <w:t>Timing assumes about 140 words per minute. The same text is in the speaker notes of the matching slides.</w:t>
       </w:r>
     </w:p>
     <w:p>
@@ -697,7 +697,7 @@
           <w:i/>
           <w:color w:val="6B5A72"/>
         </w:rPr>
-        <w:t>Problem and system overview   ·   slides 3–4  (plus the opening on slides 1–2)   ·   about 2.8 minutes (398 words)</w:t>
+        <w:t>Problem and system overview   ·   slides 2–3  (plus the opening on slide 1)   ·   115 words, about 50 seconds</w:t>
       </w:r>
     </w:p>
     <w:p>
@@ -714,7 +714,7 @@
           <w:b w:val="0"/>
           <w:i w:val="0"/>
         </w:rPr>
-        <w:t>Good morning everyone. We are presenting an explainable prototype for the early detection of Alzheimer's disease, using two signals: MRI scans and handwriting. Before we start, one sentence that frames everything: all of our data is synthetic, so what we show you is how the system works and how it behaves, not how it would perform on patients.</w:t>
+        <w:t>Good morning everyone. We're presenting an explainable prototype for early Alzheimer's detection from MRI and handwriting. All our data is synthetic.</w:t>
       </w:r>
     </w:p>
     <w:p>
@@ -722,7 +722,7 @@
         <w:pStyle w:val="Heading2"/>
       </w:pPr>
       <w:r>
-        <w:t>Slide 2: Who is presenting what</w:t>
+        <w:t>Slide 2: Early detection needs evidence you can check</w:t>
       </w:r>
     </w:p>
     <w:p>
@@ -731,7 +731,7 @@
           <w:b w:val="0"/>
           <w:i w:val="0"/>
         </w:rPr>
-        <w:t>There are seven of us, and each person covers one part of the project, in pipeline order. I will explain the problem and how the system fits together. Sathwik covers the data, Harit the MRI model, Shreya the results, Taneesha the explanations and robustness, Nithyashree the handwriting module, and Arshi finishes with performance, limits and next steps. We will finish with a short live demo and questions.</w:t>
+        <w:t>I'm Malhar. Alzheimer's moves through stages, and earlier detection gives patients more options. But early MRI changes are subtle, a bare label gives doctors nothing to check, and records are messy. Our answer: a VGG19 stage classifier, Grad-CAM explanations, a data-cleaning pipeline, and a second signal from handwriting.</w:t>
       </w:r>
     </w:p>
     <w:p>
@@ -739,7 +739,7 @@
         <w:pStyle w:val="Heading2"/>
       </w:pPr>
       <w:r>
-        <w:t>Slide 3: Early detection needs evidence you can check</w:t>
+        <w:t>Slide 3: One app, two signals, every answer explained</w:t>
       </w:r>
     </w:p>
     <w:p>
@@ -748,24 +748,7 @@
           <w:b w:val="0"/>
           <w:i w:val="0"/>
         </w:rPr>
-        <w:t>Hi everyone, I'm Malhar, and I'll start with why we built this. Alzheimer's does not arrive overnight. It moves through stages: normal cognition, early mild cognitive impairment, late mild cognitive impairment, and then Alzheimer's disease. The earlier we can see that shift, the more options a patient has. But there are three problems. First, the early changes in an MRI are subtle: slightly larger ventricles, slightly thinner cortex. Second, a model that only outputs a label gives a doctor nothing to check. And third, real clinical data is messy. Records have gaps, and most people in a cohort are healthy, so a lazy model can look accurate while missing the people who are ill. Our project answers each of those. A VGG19 network classifies the stage. Grad-CAM shows where it looked, and an automatic check flags a suspicious explanation. A cleaning pipeline handles missing values and class imbalance. And we added a second, cheap signal: handwriting.</w:t>
-      </w:r>
-    </w:p>
-    <w:p>
-      <w:pPr>
-        <w:pStyle w:val="Heading2"/>
-      </w:pPr>
-      <w:r>
-        <w:t>Slide 4: One app, two signals, every answer explained</w:t>
-      </w:r>
-    </w:p>
-    <w:p>
-      <w:r>
-        <w:rPr>
-          <w:b w:val="0"/>
-          <w:i w:val="0"/>
-        </w:rPr>
-        <w:t>Here is how it fits together. The browser talks to one FastAPI service. Behind it sit two analyzers. The MRI predictor returns stage probabilities plus a Grad-CAM map, and the handwriting analyzer scores a spiral drawing from the pen's motion. On the right is the real prototype, running. One important point before we go on: all of our data is synthetic. The MRI slices are generated phantoms, not real scans, and the drawings are simulated. So every number you will hear tells you that the pipeline works and how it behaves, not that it detects disease in patients. We state that in the paper and we will keep stating it today. Next, Sathwik will explain the data.</w:t>
+        <w:t>A FastAPI service sits behind the browser with two analyzers: the MRI predictor gives stage probabilities and a Grad-CAM map, and the handwriting analyzer scores a spiral drawing. Remember, all data is synthetic, so our numbers describe the pipeline, not patients. Sathwik will cover the data.</w:t>
       </w:r>
     </w:p>
     <w:tbl>
@@ -821,7 +804,7 @@
           <w:i/>
           <w:color w:val="6B5A72"/>
         </w:rPr>
-        <w:t>Data, imputation and balancing   ·   slides 5–6   ·   about 2.0 minutes (281 words)</w:t>
+        <w:t>Data, imputation and balancing   ·   slides 4–5   ·   115 words, about 50 seconds</w:t>
       </w:r>
     </w:p>
     <w:p>
@@ -829,7 +812,7 @@
         <w:pStyle w:val="Heading2"/>
       </w:pPr>
       <w:r>
-        <w:t>Slide 5: Why we generate our own data</w:t>
+        <w:t>Slide 4: Why we generate our own data</w:t>
       </w:r>
     </w:p>
     <w:p>
@@ -838,7 +821,7 @@
           <w:b w:val="0"/>
           <w:i w:val="0"/>
         </w:rPr>
-        <w:t>Thanks, Malhar. I'm Sathwik, and I'll cover the data. Getting real ADNI scans needs an application that takes weeks, so we built a generator. It draws axial phantoms where, as the stage advances, the ventricles get bigger, the cortex gets thinner and the hippocampus shrinks. You can see the four stages on the left. Alongside the images it generates a clinical table: age, MMSE, CDR, ADAS-Cog, hippocampal volume, APOE4 and CSF amyloid. Two realistic problems are built in. The classes are imbalanced, about three point two to one, with healthy controls the biggest group, as the chart shows. And values go missing more often in the later stages, which is exactly what happens in real records. If you simply delete incomplete rows, you throw away the sickest patients first.</w:t>
+        <w:t>Thanks, Malhar. I'm Sathwik. Real ADNI scans take weeks to access, so we built a generator. Its phantoms get larger ventricles, thinner cortex and a smaller hippocampus as stages advance, plus a clinical table with realistic gaps. The classes are imbalanced, about three to one, and later stages lose more values, so deleting incomplete rows discards the sickest patients first.</w:t>
       </w:r>
     </w:p>
     <w:p>
@@ -846,7 +829,7 @@
         <w:pStyle w:val="Heading2"/>
       </w:pPr>
       <w:r>
-        <w:t>Slide 6: Hot-deck kept the spread; ADASYN did not help</w:t>
+        <w:t>Slide 5: Hot-deck kept the spread; ADASYN did not help</w:t>
       </w:r>
     </w:p>
     <w:p>
@@ -855,7 +838,7 @@
           <w:b w:val="0"/>
           <w:i w:val="0"/>
         </w:rPr>
-        <w:t>So we handle this in two steps. First, hot-deck imputation. Every gap is filled with a real value copied from a similar complete patient, chosen among the five nearest, and from the same stage during training. We tested it by hiding twenty percent of known values and scoring the guesses. Mean imputation destroys the spread of the data. Its variance ratio is zero, and it fills Alzheimer's patients with a hippocampal volume far too large. Hot-deck keeps the variance at about one. The trade-off is that each individual guess is a little noisier. Second, ADASYN, which creates synthetic minority records. It balances the classes exactly, but when we tested it downstream over thirty splits the macro F1 did not change in any meaningful way: minus 0.002, with a spread bigger than that. So we report it as correctly implemented, but not proven useful on this data. Harit will take it from here.</w:t>
+        <w:t>We fix this in two steps. Hot-deck imputation copies real values from similar patients and, unlike mean imputation, keeps the data's variance near one. ADASYN then balances the classes exactly, but over thirty splits it changed macro F1 by just minus 0.002, so we call it implemented, not proven useful. Harit will explain the model.</w:t>
       </w:r>
     </w:p>
     <w:tbl>
@@ -911,7 +894,7 @@
           <w:i/>
           <w:color w:val="6B5A72"/>
         </w:rPr>
-        <w:t>The MRI model   ·   slides 7–8   ·   about 1.9 minutes (270 words)</w:t>
+        <w:t>The MRI model   ·   slides 6–7   ·   115 words, about 50 seconds</w:t>
       </w:r>
     </w:p>
     <w:p>
@@ -919,7 +902,7 @@
         <w:pStyle w:val="Heading2"/>
       </w:pPr>
       <w:r>
-        <w:t>Slide 7: A pretrained VGG19, fine-tuned where it matters</w:t>
+        <w:t>Slide 6: A pretrained VGG19, fine-tuned where it matters</w:t>
       </w:r>
     </w:p>
     <w:p>
@@ -928,7 +911,7 @@
           <w:b w:val="0"/>
           <w:i w:val="0"/>
         </w:rPr>
-        <w:t>Thanks, Sathwik. I'm Harit, and I'll explain the MRI model. We did not train a network from scratch, because with a few hundred slices that is hopeless. Instead we use VGG19, pretrained on ImageNet, and keep its early layers frozen, because edges and textures are useful for any image, including the way enlarged ventricles look. We unfreeze only the last convolutional block so it can adapt to MRI texture, and we replace the old thousand-class head with a small new one: down to 512, then 256, then four outputs, one per stage, with dropout in between. In total the network has 33 million parameters, of which 22.4 million are trainable. We also swap the in-place activations for normal ones. It is a small detail, but Grad-CAM has to read those values, and in-place layers overwrite them.</w:t>
+        <w:t>Thanks, Sathwik. I'm Harit. We did not train from scratch: VGG19 is pretrained on ImageNet, with early layers frozen. We fine-tune only the last convolutional block and replace the head with a new one ending in four stage outputs. That is 33 million parameters in total, 22.4 million of them trainable. We also use normal activations, so Grad-CAM can read them.</w:t>
       </w:r>
     </w:p>
     <w:p>
@@ -936,7 +919,7 @@
         <w:pStyle w:val="Heading2"/>
       </w:pPr>
       <w:r>
-        <w:t>Slide 8: How it was trained, and what we evaluated</w:t>
+        <w:t>Slide 7: How it was trained, and what we evaluated</w:t>
       </w:r>
     </w:p>
     <w:p>
@@ -945,7 +928,7 @@
           <w:b w:val="0"/>
           <w:i w:val="0"/>
         </w:rPr>
-        <w:t>For training we used AdamW with a learning rate ten times higher for the new head than for the backbone, so the head converges without damaging the pretrained filters. The loss uses label smoothing and weights that favour the rare stages, and we pick the checkpoint by validation macro F1, not accuracy, because accuracy rewards a model that ignores Alzheimer's. Early stopping watches the same metric. Now an honest point about the checkpoint we evaluated. It was selected at the very first epoch, with a validation macro F1 of exactly one. That tells us the validation set is saturated, because synthetic phantoms are easy, so model selection carried almost no information. And we did not retrain it: every result you will see comes from running the released checkpoint. Shreya will show what it does.</w:t>
+        <w:t>Training uses AdamW, label smoothing and class weights, and we pick checkpoints by validation macro F1, not accuracy. An honest note: our checkpoint came from epoch one with a perfect validation score, so the validation set is saturated. We did not retrain; every result comes from the released checkpoint. Shreya will show the results.</w:t>
       </w:r>
     </w:p>
     <w:tbl>
@@ -1001,7 +984,7 @@
           <w:i/>
           <w:color w:val="6B5A72"/>
         </w:rPr>
-        <w:t>MRI results and benchmarks   ·   slides 9–10   ·   about 1.8 minutes (258 words)</w:t>
+        <w:t>MRI results and benchmarks   ·   slides 8–9   ·   115 words, about 50 seconds</w:t>
       </w:r>
     </w:p>
     <w:p>
@@ -1009,7 +992,7 @@
         <w:pStyle w:val="Heading2"/>
       </w:pPr>
       <w:r>
-        <w:t>Slide 9: Reproduced exactly, then tested on fresh data</w:t>
+        <w:t>Slide 8: Reproduced exactly, then tested on fresh data</w:t>
       </w:r>
     </w:p>
     <w:p>
@@ -1018,7 +1001,7 @@
           <w:b w:val="0"/>
           <w:i w:val="0"/>
         </w:rPr>
-        <w:t>Thanks, Harit. I'm Shreya, and I'll go through the benchmarks. The first question: can we trust the numbers the project already reported? We regenerated the original cohort, applied the same split, and ran the released checkpoint. We got 95.35 percent accuracy, a macro F1 of 0.9653, and a confusion matrix identical to the one in the documentation, so it reproduces exactly. But that test set is only 43 slices. So we generated three fresh cohorts the model had never seen, 1,065 slices in total, and got 97.8 percent accuracy and a macro F1 of 0.978, with a 95 percent confidence interval from 0.968 to 0.986. Every seed lands between 97.5 and 98.6 percent. So the original figure was a small-sample estimate, not a lucky result.</w:t>
+        <w:t>Thanks, Harit. I'm Shreya. First, we reproduced the project's own reported numbers exactly: 95.35 percent accuracy and an identical confusion matrix on 43 slices. Then we tested three fresh cohorts, 1,065 unseen slices: 97.8 percent accuracy and macro F1 0.978, with a confidence interval from 0.968 to 0.986. The original figure was a small-sample estimate, not luck.</w:t>
       </w:r>
     </w:p>
     <w:p>
@@ -1026,7 +1009,7 @@
         <w:pStyle w:val="Heading2"/>
       </w:pPr>
       <w:r>
-        <w:t>Slide 10: Every error is between neighbouring stages</w:t>
+        <w:t>Slide 9: Every error is between neighbouring stages</w:t>
       </w:r>
     </w:p>
     <w:p>
@@ -1035,7 +1018,7 @@
           <w:b w:val="0"/>
           <w:i w:val="0"/>
         </w:rPr>
-        <w:t>Where does it go wrong? Of the 23 errors, every single one is between neighbouring stages. The model never confuses normal with Alzheimer's directly. The weakest class is early MCI: 14 of those slices are read as late MCI and 5 as normal. That matters because our screening metric, early-detection recall, is 0.992: five of 615 impaired slices were called normal. We also measured calibration and found something unusual. The model is underconfident. On one cohort the accuracy is 98.6 percent, but the average confidence is 91.8 percent. And the confidence is still informative: about 0.92 when it is right and 0.74 when it is wrong. So the model is cautious, not overconfident, although we have not investigated why. Now Taneesha will show how we check what the model is actually looking at.</w:t>
+        <w:t>All 23 errors are between neighbouring stages; the model never confuses normal with Alzheimer's directly. Early-detection recall is 0.992, with five of 615 impaired slices called normal. The model is also underconfident: accuracy is 98.6 percent but average confidence only 91.8. Confidence still separates right from wrong: 0.92 versus 0.74. Taneesha will show what the model looks at.</w:t>
       </w:r>
     </w:p>
     <w:tbl>
@@ -1091,7 +1074,7 @@
           <w:i/>
           <w:color w:val="6B5A72"/>
         </w:rPr>
-        <w:t>Explainability and robustness   ·   slides 11–12   ·   about 2.1 minutes (289 words)</w:t>
+        <w:t>Explainability and robustness   ·   slides 10–11   ·   115 words, about 50 seconds</w:t>
       </w:r>
     </w:p>
     <w:p>
@@ -1099,7 +1082,7 @@
         <w:pStyle w:val="Heading2"/>
       </w:pPr>
       <w:r>
-        <w:t>Slide 11: Explanations you can check, not just trust</w:t>
+        <w:t>Slide 10: Explanations you can check, not just trust</w:t>
       </w:r>
     </w:p>
     <w:p>
@@ -1108,7 +1091,7 @@
           <w:b w:val="0"/>
           <w:i w:val="0"/>
         </w:rPr>
-        <w:t>Thanks, Shreya. I'm Taneesha, and I'll cover explainability. A label alone invites trust; a picture invites checking. For every scan we compute a Grad-CAM map. We take the gradient of the predicted stage's score with respect to the last convolutional layer and use it to weight the feature maps, so warm regions are the ones that pushed the score up. In the interface you drag a slider to wipe between the scan and the map. You can also ask a counterfactual. On this healthy scan we asked what would make it Alzheimer's, and the map is almost entirely cold: the model finds no evidence. On top of that we built an attention audit. It measures how much of the map falls in the central half of the frame, where brain tissue is, and flags the prediction if that drops below forty percent.</w:t>
+        <w:t>Thanks, Shreya. I'm Taneesha. For every scan, Grad-CAM shows which regions of the scan pushed the score up, and you can drag a slider between scan and map. You can even ask what would make a healthy scan Alzheimer's, and the map stays almost entirely cold. An attention audit flags maps with under forty percent of their weight centrally.</w:t>
       </w:r>
     </w:p>
     <w:p>
@@ -1116,7 +1099,7 @@
         <w:pStyle w:val="Heading2"/>
       </w:pPr>
       <w:r>
-        <w:t>Slide 12: Clean-data scores do not survive degraded images</w:t>
+        <w:t>Slide 11: Clean-data scores do not survive degraded images</w:t>
       </w:r>
     </w:p>
     <w:p>
@@ -1125,7 +1108,7 @@
           <w:b w:val="0"/>
           <w:i w:val="0"/>
         </w:rPr>
-        <w:t>Now the part we think it is most important to be honest about. On 710 slices the audit never fired, the lowest central share was 0.587, and it did not separate right predictions from wrong ones. On clean phantoms it is a sanity check, not a detector. And when we degraded the images, performance dropped fast. Noise at 0.10 took macro F1 from 0.987 to 0.648, and blur and JPEG compression took it to around 0.81 to 0.82. Brightness and contrast shifts barely change macro F1 but cut early-detection recall to about 0.89, so impaired scans are read as normal, which is the costly direction. Here is a real miss from the prototype: a true early-MCI slice predicted normal with 78 percent confidence. The lesson is that a score on clean synthetic data says very little about messy real acquisitions. Nithyashree will now introduce our second signal.</w:t>
+        <w:t>Now the honest part. The audit never fired on 710 slices, so on clean data it is only a sanity check. And degraded images hurt: noise of 0.10 drops macro F1 from 0.987 to 0.648, and brightness shifts cut early-detection recall to about 0.89. Clean synthetic scores say little about real scans. Nithyashree will present handwriting.</w:t>
       </w:r>
     </w:p>
     <w:tbl>
@@ -1181,7 +1164,7 @@
           <w:i/>
           <w:color w:val="6B5A72"/>
         </w:rPr>
-        <w:t>The handwriting module   ·   slides 13–14   ·   about 2.0 minutes (285 words)</w:t>
+        <w:t>The handwriting module   ·   slides 12–13   ·   115 words, about 50 seconds</w:t>
       </w:r>
     </w:p>
     <w:p>
@@ -1189,7 +1172,7 @@
         <w:pStyle w:val="Heading2"/>
       </w:pPr>
       <w:r>
-        <w:t>Slide 13: Handwriting: the pen's motion, not the picture</w:t>
+        <w:t>Slide 12: Handwriting: the pen's motion, not the picture</w:t>
       </w:r>
     </w:p>
     <w:p>
@@ -1198,7 +1181,7 @@
           <w:b w:val="0"/>
           <w:i w:val="0"/>
         </w:rPr>
-        <w:t>Thanks, Taneesha. I'm Nithyashree, and I'll present the handwriting module. Studies report that people with cognitive decline draw more slowly, with more hesitation, more time with the pen lifted, and a wobblier line. So we built a spiral-drawing test. In the browser you draw a spiral outward from the centre, and we record every pen point with its timestamp. The screenshot on the left is a live drawing. From the trace we compute nine measurements: drawing time, pen speed, how variable the speed is, stalled time, pen-up time, speed peaks, tremor in the four-to-twelve hertz band, spiral irregularity and drawing size. All lengths are measured relative to the canvas, so screen size does not matter. A mouse or a finger gives no pressure data, so that is a limitation compared with a tablet.</w:t>
+        <w:t>Thanks, Taneesha. I'm Nithyashree. Studies link cognitive decline to slower, more hesitant, wobblier handwriting. So you draw a spiral in the browser, and we record every pen point with its timestamp. From that trace we compute nine measurements, such as speed, stalls, tremor and spiral irregularity, all relative to canvas size. A mouse or finger gives no pressure data.</w:t>
       </w:r>
     </w:p>
     <w:p>
@@ -1206,7 +1189,7 @@
         <w:pStyle w:val="Heading2"/>
       </w:pPr>
       <w:r>
-        <w:t>Slide 14: An interpretable score, with one big caveat</w:t>
+        <w:t>Slide 13: An interpretable score, with one big caveat</w:t>
       </w:r>
     </w:p>
     <w:p>
@@ -1215,7 +1198,7 @@
           <w:b w:val="0"/>
           <w:i w:val="0"/>
         </w:rPr>
-        <w:t>The classifier is deliberately simple: a logistic regression. That means every prediction splits exactly into per-feature contributions. The bar chart in the screenshot shows what pushed the score up or down, and the drawing is coloured by speed, so stalls and stop-start motion are visible. On 600 held-out drawings it reaches an AUC of 0.962 and about 89 percent accuracy. Now the caveat, and it is a big one: there is no real handwriting data in our repository, so the model was trained on drawings from a simulator that we wrote. It learned our assumptions. We also stress-tested it. Dropping samples, timestamp jitter and cutting the drawing short barely matter, but heavy coordinate noise breaks the decision threshold. Accuracy falls to 65 percent at four pixels of noise while the AUC stays at 0.93. So the ranking holds, but the cut-off does not. Arshi will wrap up with performance and next steps.</w:t>
+        <w:t>A logistic regression scores the drawing, so each prediction splits exactly into per-feature contributions. On 600 held-out simulated drawings it reaches an AUC of 0.962. The big caveat: it was trained on simulated drawings, so it learned our assumptions. Heavy coordinate noise drops accuracy to 65 percent, though AUC stays 0.93. Arshi will finish with performance.</w:t>
       </w:r>
     </w:p>
     <w:tbl>
@@ -1271,7 +1254,7 @@
           <w:i/>
           <w:color w:val="6B5A72"/>
         </w:rPr>
-        <w:t>Performance, limits and next steps   ·   slides 15–16   ·   about 1.9 minutes (262 words)</w:t>
+        <w:t>Performance, limits and next steps   ·   slides 14–15   ·   115 words, about 50 seconds</w:t>
       </w:r>
     </w:p>
     <w:p>
@@ -1279,7 +1262,7 @@
         <w:pStyle w:val="Heading2"/>
       </w:pPr>
       <w:r>
-        <w:t>Slide 15: Responsive on four CPU cores, with one bottleneck</w:t>
+        <w:t>Slide 14: Responsive on four CPU cores, with one bottleneck</w:t>
       </w:r>
     </w:p>
     <w:p>
@@ -1288,7 +1271,7 @@
           <w:b w:val="0"/>
           <w:i w:val="0"/>
         </w:rPr>
-        <w:t>Thanks, Nithyashree. I'm Arshi, and I'll finish with performance, limits and next steps. We measured everything on four CPU cores with no GPU. The handwriting score takes about 10 milliseconds. An MRI prediction takes 111 milliseconds, and adding the Grad-CAM explanation takes 293, because of the extra backward pass. Over HTTP the overhead is tiny. There is one honest bottleneck: throughput did not increase with more clients. It stays at about 9 predictions or 3.6 explanations per second per worker, because each request runs a blocking forward pass in a single worker. So serving more people needs more workers or a GPU. On the right is the finished interface: the verdict, the stage track, the draggable attribution, the probabilities and the attention audit.</w:t>
+        <w:t>Thanks, Nithyashree. I'm Arshi. On four CPU cores with no GPU, the handwriting score takes about 10 milliseconds, an MRI prediction 111, and adding the Grad-CAM explanation 293. One bottleneck: a worker handles about nine predictions or 3.6 explanations a second, because requests run one at a time. More users need more workers or a GPU.</w:t>
       </w:r>
     </w:p>
     <w:p>
@@ -1296,7 +1279,7 @@
         <w:pStyle w:val="Heading2"/>
       </w:pPr>
       <w:r>
-        <w:t>Slide 16: What we can claim, and what comes next</w:t>
+        <w:t>Slide 15: What we can claim, and what comes next</w:t>
       </w:r>
     </w:p>
     <w:p>
@@ -1305,7 +1288,7 @@
           <w:b w:val="0"/>
           <w:i w:val="0"/>
         </w:rPr>
-        <w:t>So what can we claim? The pipeline works end to end, it is reproducible, the explanations are exact for the handwriting model and checkable for the MRI model, and it is fast enough to demo on a laptop. What we cannot claim is clinical performance. The data are synthetic, the model is brittle to image degradation, and the combined score in the interface is just an average, not a trained multimodal model. The next steps, in order: real data, with ADNI for MRI and a tablet dataset such as DARWIN for handwriting, and subject-level splits; calibration and thresholds chosen for the cost of missing a patient; training for robustness; faithfulness tests for the explanations; a learned fusion once paired data exists; and engineering hardening. Thank you. We are happy to take questions, and we can run the live demo.</w:t>
+        <w:t>What can we claim? The pipeline works end to end, reproduces exactly, and explains its answers. What we cannot claim is clinical performance: the data are synthetic, image noise breaks the model, and the combined score is just an average. Next come real data such as ADNI and DARWIN, calibration, robustness training and a learned fusion. Thank you all.</w:t>
       </w:r>
     </w:p>
     <w:tbl>
@@ -1361,7 +1344,7 @@
           <w:i/>
           <w:color w:val="6B5A72"/>
         </w:rPr>
-        <w:t>Slide 17   ·   Malhar leads, everyone answers questions   ·   about 0:15 plus Q&amp;A</w:t>
+        <w:t>Slide 16   ·   Malhar leads, everyone answers questions   ·   about 0:15 plus Q&amp;A</w:t>
       </w:r>
     </w:p>
     <w:p>
@@ -1369,7 +1352,7 @@
         <w:pStyle w:val="Heading2"/>
       </w:pPr>
       <w:r>
-        <w:t>Slide 17: Thank you</w:t>
+        <w:t>Slide 16: Thank you</w:t>
       </w:r>
     </w:p>
     <w:p>
@@ -1378,7 +1361,7 @@
           <w:b w:val="0"/>
           <w:i w:val="0"/>
         </w:rPr>
-        <w:t>Thank you. We are happy to take questions. If it helps, Malhar can run the live demo: upload a scan, drag the attribution slider, then draw a spiral and watch the speed trace and feature contributions appear.</w:t>
+        <w:t>Thank you. We are happy to take questions, and we can run the live demo.</w:t>
       </w:r>
     </w:p>
     <w:p>

</xml_diff>

<commit_message>
Presentation: remove presenter names from slides, point to slides in the script
Slides 2-15 now carry a topic label instead of a presenter badge. The script
document states which slides each person presents, marks slide changes inside
each script, and no longer has a blank page.

Co-Authored-By: Claude Sonnet 5.5 <noreply@anthropic.com>
Claude-Session: https://claude.ai/code/session_01E3Fcwf7VFF2nYXAmgumQT3
</commit_message>
<xml_diff>
--- a/presentation/Presentation_Scripts.docx
+++ b/presentation/Presentation_Scripts.docx
@@ -655,7 +655,7 @@
         <w:pStyle w:val="ListBullet"/>
       </w:pPr>
       <w:r>
-        <w:t>Every script ends by handing over to the next person by name. Keep those hand-offs; they make the talk feel like one story.</w:t>
+        <w:t>Slides carry no names. Find your part by the slide number (bottom-right of each slide) in the table above and the "You present slides" line on your page.</w:t>
       </w:r>
     </w:p>
     <w:p>
@@ -663,7 +663,7 @@
         <w:pStyle w:val="ListBullet"/>
       </w:pPr>
       <w:r>
-        <w:t>Say the synthetic-data point in your own voice if you can: all data are synthetic, so the numbers describe the pipeline, not patients.</w:t>
+        <w:t>Every script ends by naming the next speaker. Keep those hand-offs.</w:t>
       </w:r>
     </w:p>
     <w:p>
@@ -671,20 +671,30 @@
         <w:pStyle w:val="ListBullet"/>
       </w:pPr>
       <w:r>
-        <w:t>If you are asked something outside your part, name the teammate who covered it.</w:t>
-      </w:r>
-    </w:p>
-    <w:p>
-      <w:r>
-        <w:br w:type="page"/>
+        <w:t>Say the synthetic-data point in your own words: the numbers describe the pipeline, not patients.</w:t>
       </w:r>
     </w:p>
     <w:p>
       <w:pPr>
         <w:pStyle w:val="Heading1"/>
+        <w:pageBreakBefore/>
       </w:pPr>
       <w:r>
         <w:t>1. Malhar Srivatsav</w:t>
+      </w:r>
+    </w:p>
+    <w:p>
+      <w:pPr>
+        <w:spacing w:after="40"/>
+      </w:pPr>
+      <w:r>
+        <w:rPr>
+          <w:b/>
+          <w:i w:val="0"/>
+          <w:color w:val="5B3A6B"/>
+          <w:sz w:val="26"/>
+        </w:rPr>
+        <w:t>YOU PRESENT SLIDES 2 AND 3</w:t>
       </w:r>
     </w:p>
     <w:p>
@@ -697,7 +707,7 @@
           <w:i/>
           <w:color w:val="6B5A72"/>
         </w:rPr>
-        <w:t>Problem and system overview   ·   slides 2–3  (plus the opening on slide 1)   ·   115 words, about 50 seconds</w:t>
+        <w:t>Problem and system overview  (plus the opening on slide 1)   ·   115 words, about 50 seconds</w:t>
       </w:r>
     </w:p>
     <w:p>
@@ -719,6 +729,20 @@
     </w:p>
     <w:p>
       <w:pPr>
+        <w:spacing w:after="120"/>
+      </w:pPr>
+      <w:r>
+        <w:rPr>
+          <w:b w:val="0"/>
+          <w:i/>
+          <w:color w:val="8A7A92"/>
+          <w:sz w:val="20"/>
+        </w:rPr>
+        <w:t>[ advance to slide 2 ]</w:t>
+      </w:r>
+    </w:p>
+    <w:p>
+      <w:pPr>
         <w:pStyle w:val="Heading2"/>
       </w:pPr>
       <w:r>
@@ -732,6 +756,20 @@
           <w:i w:val="0"/>
         </w:rPr>
         <w:t>I'm Malhar. Alzheimer's moves through stages, and earlier detection gives patients more options. But early MRI changes are subtle, a bare label gives doctors nothing to check, and records are messy. Our answer: a VGG19 stage classifier, Grad-CAM explanations, a data-cleaning pipeline, and a second signal from handwriting.</w:t>
+      </w:r>
+    </w:p>
+    <w:p>
+      <w:pPr>
+        <w:spacing w:after="120"/>
+      </w:pPr>
+      <w:r>
+        <w:rPr>
+          <w:b w:val="0"/>
+          <w:i/>
+          <w:color w:val="8A7A92"/>
+          <w:sz w:val="20"/>
+        </w:rPr>
+        <w:t>[ advance to slide 3 ]</w:t>
       </w:r>
     </w:p>
     <w:p>
@@ -782,16 +820,26 @@
       </w:tr>
     </w:tbl>
     <w:p>
+      <w:pPr>
+        <w:pStyle w:val="Heading1"/>
+        <w:pageBreakBefore/>
+      </w:pPr>
       <w:r>
-        <w:br w:type="page"/>
+        <w:t>2. Sathwik Hejamady Bhat</w:t>
       </w:r>
     </w:p>
     <w:p>
       <w:pPr>
-        <w:pStyle w:val="Heading1"/>
+        <w:spacing w:after="40"/>
       </w:pPr>
       <w:r>
-        <w:t>2. Sathwik Hejamady Bhat</w:t>
+        <w:rPr>
+          <w:b/>
+          <w:i w:val="0"/>
+          <w:color w:val="5B3A6B"/>
+          <w:sz w:val="26"/>
+        </w:rPr>
+        <w:t>YOU PRESENT SLIDES 4 AND 5</w:t>
       </w:r>
     </w:p>
     <w:p>
@@ -804,7 +852,7 @@
           <w:i/>
           <w:color w:val="6B5A72"/>
         </w:rPr>
-        <w:t>Data, imputation and balancing   ·   slides 4–5   ·   115 words, about 50 seconds</w:t>
+        <w:t>Data, imputation and balancing   ·   115 words, about 50 seconds</w:t>
       </w:r>
     </w:p>
     <w:p>
@@ -822,6 +870,20 @@
           <w:i w:val="0"/>
         </w:rPr>
         <w:t>Thanks, Malhar. I'm Sathwik. Real ADNI scans take weeks to access, so we built a generator. Its phantoms get larger ventricles, thinner cortex and a smaller hippocampus as stages advance, plus a clinical table with realistic gaps. The classes are imbalanced, about three to one, and later stages lose more values, so deleting incomplete rows discards the sickest patients first.</w:t>
+      </w:r>
+    </w:p>
+    <w:p>
+      <w:pPr>
+        <w:spacing w:after="120"/>
+      </w:pPr>
+      <w:r>
+        <w:rPr>
+          <w:b w:val="0"/>
+          <w:i/>
+          <w:color w:val="8A7A92"/>
+          <w:sz w:val="20"/>
+        </w:rPr>
+        <w:t>[ advance to slide 5 ]</w:t>
       </w:r>
     </w:p>
     <w:p>
@@ -872,16 +934,26 @@
       </w:tr>
     </w:tbl>
     <w:p>
+      <w:pPr>
+        <w:pStyle w:val="Heading1"/>
+        <w:pageBreakBefore/>
+      </w:pPr>
       <w:r>
-        <w:br w:type="page"/>
+        <w:t>3. Harit Raval</w:t>
       </w:r>
     </w:p>
     <w:p>
       <w:pPr>
-        <w:pStyle w:val="Heading1"/>
+        <w:spacing w:after="40"/>
       </w:pPr>
       <w:r>
-        <w:t>3. Harit Raval</w:t>
+        <w:rPr>
+          <w:b/>
+          <w:i w:val="0"/>
+          <w:color w:val="5B3A6B"/>
+          <w:sz w:val="26"/>
+        </w:rPr>
+        <w:t>YOU PRESENT SLIDES 6 AND 7</w:t>
       </w:r>
     </w:p>
     <w:p>
@@ -894,7 +966,7 @@
           <w:i/>
           <w:color w:val="6B5A72"/>
         </w:rPr>
-        <w:t>The MRI model   ·   slides 6–7   ·   115 words, about 50 seconds</w:t>
+        <w:t>The MRI model   ·   115 words, about 50 seconds</w:t>
       </w:r>
     </w:p>
     <w:p>
@@ -912,6 +984,20 @@
           <w:i w:val="0"/>
         </w:rPr>
         <w:t>Thanks, Sathwik. I'm Harit. We did not train from scratch: VGG19 is pretrained on ImageNet, with early layers frozen. We fine-tune only the last convolutional block and replace the head with a new one ending in four stage outputs. That is 33 million parameters in total, 22.4 million of them trainable. We also use normal activations, so Grad-CAM can read them.</w:t>
+      </w:r>
+    </w:p>
+    <w:p>
+      <w:pPr>
+        <w:spacing w:after="120"/>
+      </w:pPr>
+      <w:r>
+        <w:rPr>
+          <w:b w:val="0"/>
+          <w:i/>
+          <w:color w:val="8A7A92"/>
+          <w:sz w:val="20"/>
+        </w:rPr>
+        <w:t>[ advance to slide 7 ]</w:t>
       </w:r>
     </w:p>
     <w:p>
@@ -962,16 +1048,26 @@
       </w:tr>
     </w:tbl>
     <w:p>
+      <w:pPr>
+        <w:pStyle w:val="Heading1"/>
+        <w:pageBreakBefore/>
+      </w:pPr>
       <w:r>
-        <w:br w:type="page"/>
+        <w:t>4. Shreya Jain</w:t>
       </w:r>
     </w:p>
     <w:p>
       <w:pPr>
-        <w:pStyle w:val="Heading1"/>
+        <w:spacing w:after="40"/>
       </w:pPr>
       <w:r>
-        <w:t>4. Shreya Jain</w:t>
+        <w:rPr>
+          <w:b/>
+          <w:i w:val="0"/>
+          <w:color w:val="5B3A6B"/>
+          <w:sz w:val="26"/>
+        </w:rPr>
+        <w:t>YOU PRESENT SLIDES 8 AND 9</w:t>
       </w:r>
     </w:p>
     <w:p>
@@ -984,7 +1080,7 @@
           <w:i/>
           <w:color w:val="6B5A72"/>
         </w:rPr>
-        <w:t>MRI results and benchmarks   ·   slides 8–9   ·   115 words, about 50 seconds</w:t>
+        <w:t>MRI results and benchmarks   ·   115 words, about 50 seconds</w:t>
       </w:r>
     </w:p>
     <w:p>
@@ -1002,6 +1098,20 @@
           <w:i w:val="0"/>
         </w:rPr>
         <w:t>Thanks, Harit. I'm Shreya. First, we reproduced the project's own reported numbers exactly: 95.35 percent accuracy and an identical confusion matrix on 43 slices. Then we tested three fresh cohorts, 1,065 unseen slices: 97.8 percent accuracy and macro F1 0.978, with a confidence interval from 0.968 to 0.986. The original figure was a small-sample estimate, not luck.</w:t>
+      </w:r>
+    </w:p>
+    <w:p>
+      <w:pPr>
+        <w:spacing w:after="120"/>
+      </w:pPr>
+      <w:r>
+        <w:rPr>
+          <w:b w:val="0"/>
+          <w:i/>
+          <w:color w:val="8A7A92"/>
+          <w:sz w:val="20"/>
+        </w:rPr>
+        <w:t>[ advance to slide 9 ]</w:t>
       </w:r>
     </w:p>
     <w:p>
@@ -1052,16 +1162,26 @@
       </w:tr>
     </w:tbl>
     <w:p>
+      <w:pPr>
+        <w:pStyle w:val="Heading1"/>
+        <w:pageBreakBefore/>
+      </w:pPr>
       <w:r>
-        <w:br w:type="page"/>
+        <w:t>5. Taneesha Rajiv Prasad</w:t>
       </w:r>
     </w:p>
     <w:p>
       <w:pPr>
-        <w:pStyle w:val="Heading1"/>
+        <w:spacing w:after="40"/>
       </w:pPr>
       <w:r>
-        <w:t>5. Taneesha Rajiv Prasad</w:t>
+        <w:rPr>
+          <w:b/>
+          <w:i w:val="0"/>
+          <w:color w:val="5B3A6B"/>
+          <w:sz w:val="26"/>
+        </w:rPr>
+        <w:t>YOU PRESENT SLIDES 10 AND 11</w:t>
       </w:r>
     </w:p>
     <w:p>
@@ -1074,7 +1194,7 @@
           <w:i/>
           <w:color w:val="6B5A72"/>
         </w:rPr>
-        <w:t>Explainability and robustness   ·   slides 10–11   ·   115 words, about 50 seconds</w:t>
+        <w:t>Explainability and robustness   ·   115 words, about 50 seconds</w:t>
       </w:r>
     </w:p>
     <w:p>
@@ -1092,6 +1212,20 @@
           <w:i w:val="0"/>
         </w:rPr>
         <w:t>Thanks, Shreya. I'm Taneesha. For every scan, Grad-CAM shows which regions of the scan pushed the score up, and you can drag a slider between scan and map. You can even ask what would make a healthy scan Alzheimer's, and the map stays almost entirely cold. An attention audit flags maps with under forty percent of their weight centrally.</w:t>
+      </w:r>
+    </w:p>
+    <w:p>
+      <w:pPr>
+        <w:spacing w:after="120"/>
+      </w:pPr>
+      <w:r>
+        <w:rPr>
+          <w:b w:val="0"/>
+          <w:i/>
+          <w:color w:val="8A7A92"/>
+          <w:sz w:val="20"/>
+        </w:rPr>
+        <w:t>[ advance to slide 11 ]</w:t>
       </w:r>
     </w:p>
     <w:p>
@@ -1142,16 +1276,26 @@
       </w:tr>
     </w:tbl>
     <w:p>
+      <w:pPr>
+        <w:pStyle w:val="Heading1"/>
+        <w:pageBreakBefore/>
+      </w:pPr>
       <w:r>
-        <w:br w:type="page"/>
+        <w:t>6. Nithyashree Hebbar</w:t>
       </w:r>
     </w:p>
     <w:p>
       <w:pPr>
-        <w:pStyle w:val="Heading1"/>
+        <w:spacing w:after="40"/>
       </w:pPr>
       <w:r>
-        <w:t>6. Nithyashree Hebbar</w:t>
+        <w:rPr>
+          <w:b/>
+          <w:i w:val="0"/>
+          <w:color w:val="5B3A6B"/>
+          <w:sz w:val="26"/>
+        </w:rPr>
+        <w:t>YOU PRESENT SLIDES 12 AND 13</w:t>
       </w:r>
     </w:p>
     <w:p>
@@ -1164,7 +1308,7 @@
           <w:i/>
           <w:color w:val="6B5A72"/>
         </w:rPr>
-        <w:t>The handwriting module   ·   slides 12–13   ·   115 words, about 50 seconds</w:t>
+        <w:t>The handwriting module   ·   115 words, about 50 seconds</w:t>
       </w:r>
     </w:p>
     <w:p>
@@ -1182,6 +1326,20 @@
           <w:i w:val="0"/>
         </w:rPr>
         <w:t>Thanks, Taneesha. I'm Nithyashree. Studies link cognitive decline to slower, more hesitant, wobblier handwriting. So you draw a spiral in the browser, and we record every pen point with its timestamp. From that trace we compute nine measurements, such as speed, stalls, tremor and spiral irregularity, all relative to canvas size. A mouse or finger gives no pressure data.</w:t>
+      </w:r>
+    </w:p>
+    <w:p>
+      <w:pPr>
+        <w:spacing w:after="120"/>
+      </w:pPr>
+      <w:r>
+        <w:rPr>
+          <w:b w:val="0"/>
+          <w:i/>
+          <w:color w:val="8A7A92"/>
+          <w:sz w:val="20"/>
+        </w:rPr>
+        <w:t>[ advance to slide 13 ]</w:t>
       </w:r>
     </w:p>
     <w:p>
@@ -1232,16 +1390,26 @@
       </w:tr>
     </w:tbl>
     <w:p>
+      <w:pPr>
+        <w:pStyle w:val="Heading1"/>
+        <w:pageBreakBefore/>
+      </w:pPr>
       <w:r>
-        <w:br w:type="page"/>
+        <w:t>7. Arshi Garg</w:t>
       </w:r>
     </w:p>
     <w:p>
       <w:pPr>
-        <w:pStyle w:val="Heading1"/>
+        <w:spacing w:after="40"/>
       </w:pPr>
       <w:r>
-        <w:t>7. Arshi Garg</w:t>
+        <w:rPr>
+          <w:b/>
+          <w:i w:val="0"/>
+          <w:color w:val="5B3A6B"/>
+          <w:sz w:val="26"/>
+        </w:rPr>
+        <w:t>YOU PRESENT SLIDES 14 AND 15</w:t>
       </w:r>
     </w:p>
     <w:p>
@@ -1254,7 +1422,7 @@
           <w:i/>
           <w:color w:val="6B5A72"/>
         </w:rPr>
-        <w:t>Performance, limits and next steps   ·   slides 14–15   ·   115 words, about 50 seconds</w:t>
+        <w:t>Performance, limits and next steps   ·   115 words, about 50 seconds</w:t>
       </w:r>
     </w:p>
     <w:p>
@@ -1272,6 +1440,20 @@
           <w:i w:val="0"/>
         </w:rPr>
         <w:t>Thanks, Nithyashree. I'm Arshi. On four CPU cores with no GPU, the handwriting score takes about 10 milliseconds, an MRI prediction 111, and adding the Grad-CAM explanation 293. One bottleneck: a worker handles about nine predictions or 3.6 explanations a second, because requests run one at a time. More users need more workers or a GPU.</w:t>
+      </w:r>
+    </w:p>
+    <w:p>
+      <w:pPr>
+        <w:spacing w:after="120"/>
+      </w:pPr>
+      <w:r>
+        <w:rPr>
+          <w:b w:val="0"/>
+          <w:i/>
+          <w:color w:val="8A7A92"/>
+          <w:sz w:val="20"/>
+        </w:rPr>
+        <w:t>[ advance to slide 15 ]</w:t>
       </w:r>
     </w:p>
     <w:p>
@@ -1322,13 +1504,9 @@
       </w:tr>
     </w:tbl>
     <w:p>
-      <w:r>
-        <w:br w:type="page"/>
-      </w:r>
-    </w:p>
-    <w:p>
       <w:pPr>
         <w:pStyle w:val="Heading1"/>
+        <w:pageBreakBefore/>
       </w:pPr>
       <w:r>
         <w:t>Closing and live demo</w:t>
@@ -1377,13 +1555,9 @@
       </w:r>
     </w:p>
     <w:p>
-      <w:r>
-        <w:br w:type="page"/>
-      </w:r>
-    </w:p>
-    <w:p>
       <w:pPr>
         <w:pStyle w:val="Heading1"/>
+        <w:pageBreakBefore/>
       </w:pPr>
       <w:r>
         <w:t>Quick facts to have in your head</w:t>

</xml_diff>